<commit_message>
Release 0.3: update master CV
</commit_message>
<xml_diff>
--- a/assets/Kehinde_Balogun_Master_CV_2026.docx
+++ b/assets/Kehinde_Balogun_Master_CV_2026.docx
@@ -440,7 +440,7 @@
         <w:ind w:left="259" w:hanging="202"/>
       </w:pPr>
       <w:r>
-        <w:t>Led the concept, design and 2024 launch of the NDR Analytic Workspace, enabling authorised users to configure dashboards and analyses from Nigeria’s National Data Repository; trained more than 100 users across all 36 states and the FCT, national government, implementing partners and donors, with the most recent nationwide training in October 2025.</w:t>
+        <w:t>Authored the initial concept and provided senior technical and implementation leadership for the NDR Analytic Workspace, progressing from stakeholder development to an April 2024 launch involving approximately 85 stakeholders and a 2025 capacity-transfer programme reaching representatives from all 36 states and the FCT.</w:t>
       </w:r>
     </w:p>
     <w:p>
@@ -451,7 +451,7 @@
         <w:ind w:left="259" w:hanging="202"/>
       </w:pPr>
       <w:r>
-        <w:t>Lead data management and analysis for the Lagos and Akwa Ibom ART Impact Surveys as a co-investigator, including codebooks, derived variables, complex-sample estimation, replicate weights, response rates, biomarker adjustments, geospatial outputs, quality assurance and reporting.</w:t>
+        <w:t>Lead data management and analysis for the state-representative Akwa Ibom and Lagos ART Impact Surveys as a co-investigator, spanning CSPro instruments and validation rules, data specifications, SIMS dashboards, real-time field-quality monitoring, data merging and cleaning, analytical-variable derivation and survey tabulations.</w:t>
       </w:r>
     </w:p>
     <w:p>
@@ -537,7 +537,18 @@
         <w:ind w:left="259" w:hanging="202"/>
       </w:pPr>
       <w:r>
-        <w:t>NDR Analytic Workspace — configurable, role-based analytics and decision support for national HIV line-level data; governance led by NASCP with PHIS3 technical support.</w:t>
+        <w:t>NDR Analytic Workspace — configurable analytics and decision support using Apache Superset, ClickHouse and SQL Lab; governance led by NASCP with PHIS3 technical support.</w:t>
+      </w:r>
+    </w:p>
+    <w:p>
+      <w:pPr>
+        <w:pStyle w:val="ListBullet"/>
+        <w:widowControl/>
+        <w:spacing w:after="46"/>
+        <w:ind w:left="259" w:hanging="202"/>
+      </w:pPr>
+      <w:r>
+        <w:t>Survey Information Management and Monitoring System — co-developed Power BI and web dashboards, monitoring indicators and automated data-quality flags; supervised consolidation and use across approximately 20 Akwa Ibom and 30 Lagos field teams.</w:t>
       </w:r>
     </w:p>
     <w:p>
@@ -1248,7 +1259,7 @@
         <w:widowControl/>
       </w:pPr>
       <w:r>
-        <w:t>Co-investigator and analytic lead for Lagos and Akwa Ibom surveys; supported data architecture, field-quality monitoring, complex-sample analysis, replicate-weight variance estimation, biomarker adjustment, geospatial analysis and investigator reporting.</w:t>
+        <w:t>Co-investigator and data-management and analysis lead for state-representative surveys in Akwa Ibom and Lagos. Substantially developed CSPro instruments, specifications and validation rules; co-developed SIMS dashboards; led real-time field-quality monitoring, dataset integration, cleaning, derived variables and tabulations; and supervised the analysis workflow while specialists led survey weighting.</w:t>
       </w:r>
     </w:p>
     <w:p>
@@ -1864,14 +1875,6 @@
       </w:pPr>
       <w:r>
         <w:t>Hausa — Basic conversational proficiency (speaking and comprehension).</w:t>
-      </w:r>
-    </w:p>
-    <w:p>
-      <w:pPr>
-        <w:widowControl/>
-      </w:pPr>
-      <w:r>
-        <w:br w:type="page"/>
       </w:r>
     </w:p>
     <w:p>

</xml_diff>